<commit_message>
add mejoras a adjudicaciones
</commit_message>
<xml_diff>
--- a/Features/CostsModule/Features/AdjudicacionesFeature/Templates/plantilla_suministro_con_placeholders.docx
+++ b/Features/CostsModule/Features/AdjudicacionesFeature/Templates/plantilla_suministro_con_placeholders.docx
@@ -1502,7 +1502,25 @@
           <w:sz w:val="22"/>
           <w:szCs w:val="22"/>
         </w:rPr>
-        <w:t xml:space="preserve"> es una persona jurídica de Derecho Privado, constituida de acuerdo a las Leyes de la República del Perú, que se dedica a la construcción y venta de inmuebles en el territorio nacional. En ese sentido, </w:t>
+        <w:t xml:space="preserve"> es una persona jurídica de Derecho Privado, constituida </w:t>
+      </w:r>
+      <w:proofErr w:type="gramStart"/>
+      <w:r>
+        <w:rPr>
+          <w:rFonts w:ascii="Arial Narrow" w:hAnsi="Arial Narrow"/>
+          <w:sz w:val="22"/>
+          <w:szCs w:val="22"/>
+        </w:rPr>
+        <w:t>de acuerdo a</w:t>
+      </w:r>
+      <w:proofErr w:type="gramEnd"/>
+      <w:r>
+        <w:rPr>
+          <w:rFonts w:ascii="Arial Narrow" w:hAnsi="Arial Narrow"/>
+          <w:sz w:val="22"/>
+          <w:szCs w:val="22"/>
+        </w:rPr>
+        <w:t xml:space="preserve"> las Leyes de la República del Perú, que se dedica a la construcción y venta de inmuebles en el territorio nacional. En ese sentido, </w:t>
       </w:r>
       <w:r>
         <w:rPr>
@@ -1544,7 +1562,31 @@
           <w:sz w:val="22"/>
           <w:szCs w:val="22"/>
         </w:rPr>
-        <w:t>el mismo que será ejecutado en un terreno de su propiedad ubicado en {{PROYECTO_UBICACION}}.</w:t>
+        <w:t>el mismo que será ejecutado en un terreno de su propiedad ubicado en {</w:t>
+      </w:r>
+      <w:r>
+        <w:rPr>
+          <w:rFonts w:ascii="Arial Narrow" w:eastAsia="Arial Narrow" w:hAnsi="Arial Narrow" w:cs="Arial Narrow"/>
+          <w:sz w:val="22"/>
+          <w:szCs w:val="22"/>
+        </w:rPr>
+        <w:t>{</w:t>
+      </w:r>
+      <w:r>
+        <w:rPr>
+          <w:rFonts w:ascii="Arial Narrow" w:eastAsia="Arial Narrow" w:hAnsi="Arial Narrow" w:cs="Arial Narrow"/>
+          <w:sz w:val="22"/>
+          <w:szCs w:val="22"/>
+        </w:rPr>
+        <w:t>PROYECTO_UBICACION_OBRA</w:t>
+      </w:r>
+      <w:r>
+        <w:rPr>
+          <w:rFonts w:ascii="Arial Narrow" w:eastAsia="Arial Narrow" w:hAnsi="Arial Narrow" w:cs="Arial Narrow"/>
+          <w:sz w:val="22"/>
+          <w:szCs w:val="22"/>
+        </w:rPr>
+        <w:t>}}.</w:t>
       </w:r>
     </w:p>
     <w:p>
@@ -8870,7 +8912,25 @@
           <w:szCs w:val="22"/>
           <w:lang w:val="es-PE" w:eastAsia="es-PE"/>
         </w:rPr>
-        <w:t>1. Periodo de validez de la garantía: 2 años.</w:t>
+        <w:t xml:space="preserve">1. Periodo de validez de la garantía: </w:t>
+      </w:r>
+      <w:r>
+        <w:rPr>
+          <w:rFonts w:ascii="Arial Narrow" w:hAnsi="Arial Narrow" w:cs="Calibri"/>
+          <w:sz w:val="22"/>
+          <w:szCs w:val="22"/>
+          <w:lang w:val="es-PE" w:eastAsia="es-PE"/>
+        </w:rPr>
+        <w:t>{{PERIODO_VALIDEZ_GARANTIA}}</w:t>
+      </w:r>
+      <w:r>
+        <w:rPr>
+          <w:rFonts w:ascii="Arial Narrow" w:hAnsi="Arial Narrow" w:cs="Calibri"/>
+          <w:sz w:val="22"/>
+          <w:szCs w:val="22"/>
+          <w:lang w:val="es-PE" w:eastAsia="es-PE"/>
+        </w:rPr>
+        <w:t>.</w:t>
       </w:r>
     </w:p>
     <w:p>

</xml_diff>

<commit_message>
add cambios en documentos
</commit_message>
<xml_diff>
--- a/Features/CostsModule/Features/AdjudicacionesFeature/Templates/plantilla_suministro_con_placeholders.docx
+++ b/Features/CostsModule/Features/AdjudicacionesFeature/Templates/plantilla_suministro_con_placeholders.docx
@@ -8417,7 +8417,7 @@
           <w:sz w:val="18"/>
           <w:szCs w:val="18"/>
         </w:rPr>
-        <w:t>&lt;&lt;INSERTAR_ORDEN_DE_SERVICIO_AQUI&gt;&gt;</w:t>
+        <w:t>&lt;&lt;INSERTAR_COTIZACION_AQUI&gt;&gt;</w:t>
       </w:r>
     </w:p>
     <w:p>
@@ -8440,7 +8440,7 @@
           <w:sz w:val="18"/>
           <w:szCs w:val="18"/>
         </w:rPr>
-        <w:t>&lt;&lt;INSERTAR_COTIZACION_AQUI&gt;&gt;</w:t>
+        <w:t>&lt;&lt;INSERTAR_ORDEN_DE_SERVICIO_AQUI&gt;&gt;</w:t>
       </w:r>
     </w:p>
     <w:p>

</xml_diff>

<commit_message>
add cambios de adjudicaciones
</commit_message>
<xml_diff>
--- a/Features/CostsModule/Features/AdjudicacionesFeature/Templates/plantilla_suministro_con_placeholders.docx
+++ b/Features/CostsModule/Features/AdjudicacionesFeature/Templates/plantilla_suministro_con_placeholders.docx
@@ -7773,84 +7773,6 @@
     </w:p>
     <w:p>
       <w:pPr>
-        <w:ind w:left="0" w:firstLine="0"/>
-        <w:jc w:val="both"/>
-        <w:rPr>
-          <w:rFonts w:ascii="Arial Narrow" w:hAnsi="Arial Narrow"/>
-          <w:sz w:val="22"/>
-          <w:szCs w:val="22"/>
-        </w:rPr>
-      </w:pPr>
-    </w:p>
-    <w:p>
-      <w:pPr>
-        <w:ind w:left="0" w:firstLine="0"/>
-        <w:jc w:val="both"/>
-        <w:rPr>
-          <w:rFonts w:ascii="Arial Narrow" w:hAnsi="Arial Narrow"/>
-          <w:sz w:val="22"/>
-          <w:szCs w:val="22"/>
-        </w:rPr>
-      </w:pPr>
-    </w:p>
-    <w:p>
-      <w:pPr>
-        <w:ind w:left="0" w:firstLine="0"/>
-        <w:jc w:val="both"/>
-        <w:rPr>
-          <w:rFonts w:ascii="Arial Narrow" w:hAnsi="Arial Narrow"/>
-          <w:sz w:val="22"/>
-          <w:szCs w:val="22"/>
-          <w:lang w:val="es-PE"/>
-        </w:rPr>
-      </w:pPr>
-      <w:r>
-        <w:rPr>
-          <w:rFonts w:ascii="Arial Narrow" w:hAnsi="Arial Narrow"/>
-          <w:sz w:val="22"/>
-          <w:szCs w:val="22"/>
-        </w:rPr>
-        <w:t>En señal de conformidad las pares suscriben el presente documento en la ciudad de Lima, al</w:t>
-      </w:r>
-      <w:r>
-        <w:rPr>
-          <w:rFonts w:ascii="Arial Narrow" w:hAnsi="Arial Narrow"/>
-          <w:sz w:val="22"/>
-          <w:szCs w:val="22"/>
-        </w:rPr>
-        <w:t xml:space="preserve"> </w:t>
-      </w:r>
-      <w:r>
-        <w:rPr>
-          <w:rFonts w:ascii="Arial Narrow" w:hAnsi="Arial Narrow"/>
-          <w:sz w:val="22"/>
-          <w:szCs w:val="22"/>
-          <w:lang w:val="es-PE"/>
-        </w:rPr>
-        <w:t>{{FECHA_FIRMA_DEL_CONTRATO}}</w:t>
-      </w:r>
-    </w:p>
-    <w:p>
-      <w:pPr>
-        <w:ind w:left="0" w:firstLine="0"/>
-        <w:jc w:val="both"/>
-        <w:rPr>
-          <w:rFonts w:ascii="Arial Narrow" w:hAnsi="Arial Narrow"/>
-          <w:sz w:val="22"/>
-          <w:szCs w:val="22"/>
-        </w:rPr>
-      </w:pPr>
-      <w:r>
-        <w:rPr>
-          <w:rFonts w:ascii="Arial Narrow" w:hAnsi="Arial Narrow"/>
-          <w:sz w:val="22"/>
-          <w:szCs w:val="22"/>
-        </w:rPr>
-        <w:t>.</w:t>
-      </w:r>
-    </w:p>
-    <w:p>
-      <w:pPr>
         <w:tabs>
           <w:tab w:val="clear" w:pos="1440"/>
         </w:tabs>
@@ -7858,10 +7780,930 @@
         <w:jc w:val="both"/>
         <w:rPr>
           <w:rFonts w:ascii="Arial Narrow" w:hAnsi="Arial Narrow"/>
-          <w:sz w:val="22"/>
-          <w:szCs w:val="22"/>
-        </w:rPr>
-      </w:pPr>
+          <w:b/>
+          <w:bCs/>
+          <w:sz w:val="22"/>
+          <w:szCs w:val="22"/>
+        </w:rPr>
+      </w:pPr>
+    </w:p>
+    <w:tbl>
+      <w:tblPr>
+        <w:tblStyle w:val="Tablaconcuadrcula"/>
+        <w:tblpPr w:leftFromText="142" w:rightFromText="142" w:vertAnchor="page" w:horzAnchor="margin" w:tblpXSpec="center" w:tblpY="2221"/>
+        <w:tblW w:w="5000" w:type="pct"/>
+        <w:tblLook w:val="04A0" w:firstRow="1" w:lastRow="0" w:firstColumn="1" w:lastColumn="0" w:noHBand="0" w:noVBand="1"/>
+      </w:tblPr>
+      <w:tblGrid>
+        <w:gridCol w:w="3830"/>
+        <w:gridCol w:w="1949"/>
+        <w:gridCol w:w="3859"/>
+      </w:tblGrid>
+      <w:tr>
+        <w:tc>
+          <w:tcPr>
+            <w:tcW w:w="1987" w:type="pct"/>
+            <w:tcBorders>
+              <w:top w:val="nil"/>
+              <w:left w:val="nil"/>
+              <w:bottom w:val="nil"/>
+              <w:right w:val="nil"/>
+            </w:tcBorders>
+          </w:tcPr>
+          <w:p>
+            <w:pPr>
+              <w:tabs>
+                <w:tab w:val="clear" w:pos="1440"/>
+              </w:tabs>
+              <w:ind w:left="0" w:firstLine="0"/>
+              <w:rPr>
+                <w:rFonts w:ascii="Arial Narrow" w:hAnsi="Arial Narrow"/>
+                <w:b/>
+                <w:sz w:val="22"/>
+                <w:szCs w:val="22"/>
+              </w:rPr>
+            </w:pPr>
+          </w:p>
+        </w:tc>
+        <w:tc>
+          <w:tcPr>
+            <w:tcW w:w="1011" w:type="pct"/>
+            <w:tcBorders>
+              <w:top w:val="nil"/>
+              <w:left w:val="nil"/>
+              <w:bottom w:val="nil"/>
+              <w:right w:val="nil"/>
+            </w:tcBorders>
+          </w:tcPr>
+          <w:p>
+            <w:pPr>
+              <w:tabs>
+                <w:tab w:val="clear" w:pos="1440"/>
+              </w:tabs>
+              <w:ind w:left="0" w:firstLine="0"/>
+              <w:rPr>
+                <w:rFonts w:ascii="Arial Narrow" w:hAnsi="Arial Narrow"/>
+                <w:b/>
+                <w:sz w:val="22"/>
+                <w:szCs w:val="22"/>
+              </w:rPr>
+            </w:pPr>
+          </w:p>
+        </w:tc>
+        <w:tc>
+          <w:tcPr>
+            <w:tcW w:w="2002" w:type="pct"/>
+            <w:tcBorders>
+              <w:top w:val="nil"/>
+              <w:left w:val="nil"/>
+              <w:bottom w:val="nil"/>
+              <w:right w:val="nil"/>
+            </w:tcBorders>
+          </w:tcPr>
+          <w:p>
+            <w:pPr>
+              <w:tabs>
+                <w:tab w:val="clear" w:pos="1440"/>
+              </w:tabs>
+              <w:ind w:left="0" w:firstLine="0"/>
+              <w:rPr>
+                <w:rFonts w:ascii="Arial Narrow" w:hAnsi="Arial Narrow"/>
+                <w:b/>
+                <w:sz w:val="22"/>
+                <w:szCs w:val="22"/>
+              </w:rPr>
+            </w:pPr>
+          </w:p>
+        </w:tc>
+      </w:tr>
+      <w:tr>
+        <w:tc>
+          <w:tcPr>
+            <w:tcW w:w="1987" w:type="pct"/>
+            <w:tcBorders>
+              <w:top w:val="nil"/>
+              <w:left w:val="nil"/>
+              <w:bottom w:val="nil"/>
+              <w:right w:val="nil"/>
+            </w:tcBorders>
+          </w:tcPr>
+          <w:p>
+            <w:pPr>
+              <w:tabs>
+                <w:tab w:val="clear" w:pos="1440"/>
+              </w:tabs>
+              <w:ind w:left="0" w:firstLine="0"/>
+              <w:rPr>
+                <w:rFonts w:ascii="Arial Narrow" w:hAnsi="Arial Narrow"/>
+                <w:b/>
+                <w:sz w:val="22"/>
+                <w:szCs w:val="22"/>
+              </w:rPr>
+            </w:pPr>
+          </w:p>
+        </w:tc>
+        <w:tc>
+          <w:tcPr>
+            <w:tcW w:w="1011" w:type="pct"/>
+            <w:tcBorders>
+              <w:top w:val="nil"/>
+              <w:left w:val="nil"/>
+              <w:bottom w:val="nil"/>
+              <w:right w:val="nil"/>
+            </w:tcBorders>
+          </w:tcPr>
+          <w:p>
+            <w:pPr>
+              <w:tabs>
+                <w:tab w:val="clear" w:pos="1440"/>
+              </w:tabs>
+              <w:ind w:left="0" w:firstLine="0"/>
+              <w:rPr>
+                <w:rFonts w:ascii="Arial Narrow" w:hAnsi="Arial Narrow"/>
+                <w:b/>
+                <w:sz w:val="22"/>
+                <w:szCs w:val="22"/>
+              </w:rPr>
+            </w:pPr>
+          </w:p>
+        </w:tc>
+        <w:tc>
+          <w:tcPr>
+            <w:tcW w:w="2002" w:type="pct"/>
+            <w:tcBorders>
+              <w:top w:val="nil"/>
+              <w:left w:val="nil"/>
+              <w:bottom w:val="nil"/>
+              <w:right w:val="nil"/>
+            </w:tcBorders>
+          </w:tcPr>
+          <w:p>
+            <w:pPr>
+              <w:tabs>
+                <w:tab w:val="clear" w:pos="1440"/>
+              </w:tabs>
+              <w:ind w:left="0" w:firstLine="0"/>
+              <w:rPr>
+                <w:rFonts w:ascii="Arial Narrow" w:hAnsi="Arial Narrow"/>
+                <w:b/>
+                <w:sz w:val="22"/>
+                <w:szCs w:val="22"/>
+              </w:rPr>
+            </w:pPr>
+          </w:p>
+        </w:tc>
+      </w:tr>
+      <w:tr>
+        <w:tc>
+          <w:tcPr>
+            <w:tcW w:w="1987" w:type="pct"/>
+            <w:tcBorders>
+              <w:top w:val="nil"/>
+              <w:left w:val="nil"/>
+              <w:bottom w:val="nil"/>
+              <w:right w:val="nil"/>
+            </w:tcBorders>
+          </w:tcPr>
+          <w:p>
+            <w:pPr>
+              <w:tabs>
+                <w:tab w:val="clear" w:pos="1440"/>
+              </w:tabs>
+              <w:ind w:left="0" w:firstLine="0"/>
+              <w:rPr>
+                <w:rFonts w:ascii="Arial Narrow" w:hAnsi="Arial Narrow"/>
+                <w:b/>
+                <w:sz w:val="22"/>
+                <w:szCs w:val="22"/>
+              </w:rPr>
+            </w:pPr>
+          </w:p>
+        </w:tc>
+        <w:tc>
+          <w:tcPr>
+            <w:tcW w:w="1011" w:type="pct"/>
+            <w:tcBorders>
+              <w:top w:val="nil"/>
+              <w:left w:val="nil"/>
+              <w:bottom w:val="nil"/>
+              <w:right w:val="nil"/>
+            </w:tcBorders>
+          </w:tcPr>
+          <w:p>
+            <w:pPr>
+              <w:tabs>
+                <w:tab w:val="clear" w:pos="1440"/>
+              </w:tabs>
+              <w:ind w:left="0" w:firstLine="0"/>
+              <w:rPr>
+                <w:rFonts w:ascii="Arial Narrow" w:hAnsi="Arial Narrow"/>
+                <w:b/>
+                <w:sz w:val="22"/>
+                <w:szCs w:val="22"/>
+              </w:rPr>
+            </w:pPr>
+          </w:p>
+        </w:tc>
+        <w:tc>
+          <w:tcPr>
+            <w:tcW w:w="2002" w:type="pct"/>
+            <w:tcBorders>
+              <w:top w:val="nil"/>
+              <w:left w:val="nil"/>
+              <w:bottom w:val="nil"/>
+              <w:right w:val="nil"/>
+            </w:tcBorders>
+          </w:tcPr>
+          <w:p>
+            <w:pPr>
+              <w:tabs>
+                <w:tab w:val="clear" w:pos="1440"/>
+              </w:tabs>
+              <w:ind w:left="0" w:firstLine="0"/>
+              <w:rPr>
+                <w:rFonts w:ascii="Arial Narrow" w:hAnsi="Arial Narrow"/>
+                <w:b/>
+                <w:sz w:val="22"/>
+                <w:szCs w:val="22"/>
+              </w:rPr>
+            </w:pPr>
+          </w:p>
+        </w:tc>
+      </w:tr>
+      <w:tr>
+        <w:tc>
+          <w:tcPr>
+            <w:tcW w:w="1987" w:type="pct"/>
+            <w:tcBorders>
+              <w:top w:val="nil"/>
+              <w:left w:val="nil"/>
+              <w:bottom w:val="nil"/>
+              <w:right w:val="nil"/>
+            </w:tcBorders>
+          </w:tcPr>
+          <w:p>
+            <w:pPr>
+              <w:tabs>
+                <w:tab w:val="clear" w:pos="1440"/>
+              </w:tabs>
+              <w:ind w:left="0" w:firstLine="0"/>
+              <w:rPr>
+                <w:rFonts w:ascii="Arial Narrow" w:hAnsi="Arial Narrow"/>
+                <w:b/>
+                <w:sz w:val="22"/>
+                <w:szCs w:val="22"/>
+              </w:rPr>
+            </w:pPr>
+          </w:p>
+        </w:tc>
+        <w:tc>
+          <w:tcPr>
+            <w:tcW w:w="1011" w:type="pct"/>
+            <w:tcBorders>
+              <w:top w:val="nil"/>
+              <w:left w:val="nil"/>
+              <w:bottom w:val="nil"/>
+              <w:right w:val="nil"/>
+            </w:tcBorders>
+          </w:tcPr>
+          <w:p>
+            <w:pPr>
+              <w:tabs>
+                <w:tab w:val="clear" w:pos="1440"/>
+              </w:tabs>
+              <w:ind w:left="0" w:firstLine="0"/>
+              <w:rPr>
+                <w:rFonts w:ascii="Arial Narrow" w:hAnsi="Arial Narrow"/>
+                <w:b/>
+                <w:sz w:val="22"/>
+                <w:szCs w:val="22"/>
+              </w:rPr>
+            </w:pPr>
+          </w:p>
+        </w:tc>
+        <w:tc>
+          <w:tcPr>
+            <w:tcW w:w="2002" w:type="pct"/>
+            <w:tcBorders>
+              <w:top w:val="nil"/>
+              <w:left w:val="nil"/>
+              <w:bottom w:val="nil"/>
+              <w:right w:val="nil"/>
+            </w:tcBorders>
+          </w:tcPr>
+          <w:p>
+            <w:pPr>
+              <w:tabs>
+                <w:tab w:val="clear" w:pos="1440"/>
+              </w:tabs>
+              <w:ind w:left="0" w:firstLine="0"/>
+              <w:rPr>
+                <w:rFonts w:ascii="Arial Narrow" w:hAnsi="Arial Narrow"/>
+                <w:b/>
+                <w:sz w:val="22"/>
+                <w:szCs w:val="22"/>
+              </w:rPr>
+            </w:pPr>
+          </w:p>
+        </w:tc>
+      </w:tr>
+      <w:tr>
+        <w:tc>
+          <w:tcPr>
+            <w:tcW w:w="1987" w:type="pct"/>
+            <w:tcBorders>
+              <w:top w:val="nil"/>
+              <w:left w:val="nil"/>
+              <w:bottom w:val="nil"/>
+              <w:right w:val="nil"/>
+            </w:tcBorders>
+          </w:tcPr>
+          <w:p>
+            <w:pPr>
+              <w:tabs>
+                <w:tab w:val="clear" w:pos="1440"/>
+              </w:tabs>
+              <w:ind w:left="0" w:firstLine="0"/>
+              <w:rPr>
+                <w:rFonts w:ascii="Arial Narrow" w:hAnsi="Arial Narrow"/>
+                <w:b/>
+                <w:sz w:val="22"/>
+                <w:szCs w:val="22"/>
+              </w:rPr>
+            </w:pPr>
+          </w:p>
+        </w:tc>
+        <w:tc>
+          <w:tcPr>
+            <w:tcW w:w="1011" w:type="pct"/>
+            <w:tcBorders>
+              <w:top w:val="nil"/>
+              <w:left w:val="nil"/>
+              <w:bottom w:val="nil"/>
+              <w:right w:val="nil"/>
+            </w:tcBorders>
+          </w:tcPr>
+          <w:p>
+            <w:pPr>
+              <w:tabs>
+                <w:tab w:val="clear" w:pos="1440"/>
+              </w:tabs>
+              <w:ind w:left="0" w:firstLine="0"/>
+              <w:rPr>
+                <w:rFonts w:ascii="Arial Narrow" w:hAnsi="Arial Narrow"/>
+                <w:b/>
+                <w:sz w:val="22"/>
+                <w:szCs w:val="22"/>
+              </w:rPr>
+            </w:pPr>
+          </w:p>
+        </w:tc>
+        <w:tc>
+          <w:tcPr>
+            <w:tcW w:w="2002" w:type="pct"/>
+            <w:tcBorders>
+              <w:top w:val="nil"/>
+              <w:left w:val="nil"/>
+              <w:bottom w:val="nil"/>
+              <w:right w:val="nil"/>
+            </w:tcBorders>
+          </w:tcPr>
+          <w:p>
+            <w:pPr>
+              <w:tabs>
+                <w:tab w:val="clear" w:pos="1440"/>
+              </w:tabs>
+              <w:ind w:left="0" w:firstLine="0"/>
+              <w:rPr>
+                <w:rFonts w:ascii="Arial Narrow" w:hAnsi="Arial Narrow"/>
+                <w:b/>
+                <w:sz w:val="22"/>
+                <w:szCs w:val="22"/>
+              </w:rPr>
+            </w:pPr>
+          </w:p>
+        </w:tc>
+      </w:tr>
+      <w:tr>
+        <w:tc>
+          <w:tcPr>
+            <w:tcW w:w="1987" w:type="pct"/>
+            <w:tcBorders>
+              <w:top w:val="nil"/>
+              <w:left w:val="nil"/>
+              <w:bottom w:val="nil"/>
+              <w:right w:val="nil"/>
+            </w:tcBorders>
+          </w:tcPr>
+          <w:p>
+            <w:pPr>
+              <w:tabs>
+                <w:tab w:val="clear" w:pos="1440"/>
+              </w:tabs>
+              <w:ind w:left="0" w:firstLine="0"/>
+              <w:rPr>
+                <w:rFonts w:ascii="Arial Narrow" w:hAnsi="Arial Narrow"/>
+                <w:b/>
+                <w:sz w:val="22"/>
+                <w:szCs w:val="22"/>
+              </w:rPr>
+            </w:pPr>
+          </w:p>
+        </w:tc>
+        <w:tc>
+          <w:tcPr>
+            <w:tcW w:w="1011" w:type="pct"/>
+            <w:tcBorders>
+              <w:top w:val="nil"/>
+              <w:left w:val="nil"/>
+              <w:bottom w:val="nil"/>
+              <w:right w:val="nil"/>
+            </w:tcBorders>
+          </w:tcPr>
+          <w:p>
+            <w:pPr>
+              <w:tabs>
+                <w:tab w:val="clear" w:pos="1440"/>
+              </w:tabs>
+              <w:ind w:left="0" w:firstLine="0"/>
+              <w:rPr>
+                <w:rFonts w:ascii="Arial Narrow" w:hAnsi="Arial Narrow"/>
+                <w:b/>
+                <w:sz w:val="22"/>
+                <w:szCs w:val="22"/>
+              </w:rPr>
+            </w:pPr>
+          </w:p>
+        </w:tc>
+        <w:tc>
+          <w:tcPr>
+            <w:tcW w:w="2002" w:type="pct"/>
+            <w:tcBorders>
+              <w:top w:val="nil"/>
+              <w:left w:val="nil"/>
+              <w:bottom w:val="nil"/>
+              <w:right w:val="nil"/>
+            </w:tcBorders>
+          </w:tcPr>
+          <w:p>
+            <w:pPr>
+              <w:tabs>
+                <w:tab w:val="clear" w:pos="1440"/>
+              </w:tabs>
+              <w:ind w:left="0" w:firstLine="0"/>
+              <w:rPr>
+                <w:rFonts w:ascii="Arial Narrow" w:hAnsi="Arial Narrow"/>
+                <w:b/>
+                <w:sz w:val="22"/>
+                <w:szCs w:val="22"/>
+              </w:rPr>
+            </w:pPr>
+          </w:p>
+        </w:tc>
+      </w:tr>
+      <w:tr>
+        <w:tc>
+          <w:tcPr>
+            <w:tcW w:w="1987" w:type="pct"/>
+            <w:tcBorders>
+              <w:top w:val="nil"/>
+              <w:left w:val="nil"/>
+              <w:bottom w:val="nil"/>
+              <w:right w:val="nil"/>
+            </w:tcBorders>
+          </w:tcPr>
+          <w:p>
+            <w:pPr>
+              <w:tabs>
+                <w:tab w:val="clear" w:pos="1440"/>
+              </w:tabs>
+              <w:ind w:left="0" w:firstLine="0"/>
+              <w:rPr>
+                <w:rFonts w:ascii="Arial Narrow" w:hAnsi="Arial Narrow"/>
+                <w:b/>
+                <w:sz w:val="22"/>
+                <w:szCs w:val="22"/>
+              </w:rPr>
+            </w:pPr>
+          </w:p>
+        </w:tc>
+        <w:tc>
+          <w:tcPr>
+            <w:tcW w:w="1011" w:type="pct"/>
+            <w:tcBorders>
+              <w:top w:val="nil"/>
+              <w:left w:val="nil"/>
+              <w:bottom w:val="nil"/>
+              <w:right w:val="nil"/>
+            </w:tcBorders>
+          </w:tcPr>
+          <w:p>
+            <w:pPr>
+              <w:tabs>
+                <w:tab w:val="clear" w:pos="1440"/>
+              </w:tabs>
+              <w:ind w:left="0" w:firstLine="0"/>
+              <w:rPr>
+                <w:rFonts w:ascii="Arial Narrow" w:hAnsi="Arial Narrow"/>
+                <w:b/>
+                <w:sz w:val="22"/>
+                <w:szCs w:val="22"/>
+              </w:rPr>
+            </w:pPr>
+          </w:p>
+        </w:tc>
+        <w:tc>
+          <w:tcPr>
+            <w:tcW w:w="2002" w:type="pct"/>
+            <w:tcBorders>
+              <w:top w:val="nil"/>
+              <w:left w:val="nil"/>
+              <w:bottom w:val="nil"/>
+              <w:right w:val="nil"/>
+            </w:tcBorders>
+          </w:tcPr>
+          <w:p>
+            <w:pPr>
+              <w:tabs>
+                <w:tab w:val="clear" w:pos="1440"/>
+              </w:tabs>
+              <w:ind w:left="0" w:firstLine="0"/>
+              <w:rPr>
+                <w:rFonts w:ascii="Arial Narrow" w:hAnsi="Arial Narrow"/>
+                <w:b/>
+                <w:sz w:val="22"/>
+                <w:szCs w:val="22"/>
+              </w:rPr>
+            </w:pPr>
+          </w:p>
+        </w:tc>
+      </w:tr>
+      <w:tr>
+        <w:tc>
+          <w:tcPr>
+            <w:tcW w:w="1987" w:type="pct"/>
+            <w:tcBorders>
+              <w:top w:val="nil"/>
+              <w:left w:val="nil"/>
+              <w:bottom w:val="nil"/>
+              <w:right w:val="nil"/>
+            </w:tcBorders>
+          </w:tcPr>
+          <w:p>
+            <w:pPr>
+              <w:tabs>
+                <w:tab w:val="clear" w:pos="1440"/>
+              </w:tabs>
+              <w:ind w:left="0" w:firstLine="0"/>
+              <w:rPr>
+                <w:rFonts w:ascii="Arial Narrow" w:hAnsi="Arial Narrow"/>
+                <w:b/>
+                <w:sz w:val="22"/>
+                <w:szCs w:val="22"/>
+              </w:rPr>
+            </w:pPr>
+          </w:p>
+        </w:tc>
+        <w:tc>
+          <w:tcPr>
+            <w:tcW w:w="1011" w:type="pct"/>
+            <w:tcBorders>
+              <w:top w:val="nil"/>
+              <w:left w:val="nil"/>
+              <w:bottom w:val="nil"/>
+              <w:right w:val="nil"/>
+            </w:tcBorders>
+          </w:tcPr>
+          <w:p>
+            <w:pPr>
+              <w:tabs>
+                <w:tab w:val="clear" w:pos="1440"/>
+              </w:tabs>
+              <w:ind w:left="0" w:firstLine="0"/>
+              <w:rPr>
+                <w:rFonts w:ascii="Arial Narrow" w:hAnsi="Arial Narrow"/>
+                <w:b/>
+                <w:sz w:val="22"/>
+                <w:szCs w:val="22"/>
+              </w:rPr>
+            </w:pPr>
+          </w:p>
+        </w:tc>
+        <w:tc>
+          <w:tcPr>
+            <w:tcW w:w="2002" w:type="pct"/>
+            <w:tcBorders>
+              <w:top w:val="nil"/>
+              <w:left w:val="nil"/>
+              <w:bottom w:val="nil"/>
+              <w:right w:val="nil"/>
+            </w:tcBorders>
+          </w:tcPr>
+          <w:p>
+            <w:pPr>
+              <w:tabs>
+                <w:tab w:val="clear" w:pos="1440"/>
+              </w:tabs>
+              <w:ind w:left="0" w:firstLine="0"/>
+              <w:rPr>
+                <w:rFonts w:ascii="Arial Narrow" w:hAnsi="Arial Narrow"/>
+                <w:b/>
+                <w:sz w:val="22"/>
+                <w:szCs w:val="22"/>
+              </w:rPr>
+            </w:pPr>
+          </w:p>
+        </w:tc>
+      </w:tr>
+      <w:tr>
+        <w:tc>
+          <w:tcPr>
+            <w:tcW w:w="1987" w:type="pct"/>
+            <w:tcBorders>
+              <w:top w:val="nil"/>
+              <w:left w:val="nil"/>
+              <w:bottom w:val="nil"/>
+              <w:right w:val="nil"/>
+            </w:tcBorders>
+          </w:tcPr>
+          <w:p>
+            <w:pPr>
+              <w:tabs>
+                <w:tab w:val="clear" w:pos="1440"/>
+              </w:tabs>
+              <w:ind w:left="0" w:firstLine="0"/>
+              <w:rPr>
+                <w:rFonts w:ascii="Arial Narrow" w:hAnsi="Arial Narrow"/>
+                <w:b/>
+                <w:sz w:val="22"/>
+                <w:szCs w:val="22"/>
+              </w:rPr>
+            </w:pPr>
+          </w:p>
+        </w:tc>
+        <w:tc>
+          <w:tcPr>
+            <w:tcW w:w="1011" w:type="pct"/>
+            <w:tcBorders>
+              <w:top w:val="nil"/>
+              <w:left w:val="nil"/>
+              <w:bottom w:val="nil"/>
+              <w:right w:val="nil"/>
+            </w:tcBorders>
+          </w:tcPr>
+          <w:p>
+            <w:pPr>
+              <w:tabs>
+                <w:tab w:val="clear" w:pos="1440"/>
+              </w:tabs>
+              <w:ind w:left="0" w:firstLine="0"/>
+              <w:rPr>
+                <w:rFonts w:ascii="Arial Narrow" w:hAnsi="Arial Narrow"/>
+                <w:b/>
+                <w:sz w:val="22"/>
+                <w:szCs w:val="22"/>
+              </w:rPr>
+            </w:pPr>
+          </w:p>
+        </w:tc>
+        <w:tc>
+          <w:tcPr>
+            <w:tcW w:w="2002" w:type="pct"/>
+            <w:tcBorders>
+              <w:top w:val="nil"/>
+              <w:left w:val="nil"/>
+              <w:bottom w:val="nil"/>
+              <w:right w:val="nil"/>
+            </w:tcBorders>
+          </w:tcPr>
+          <w:p>
+            <w:pPr>
+              <w:tabs>
+                <w:tab w:val="clear" w:pos="1440"/>
+              </w:tabs>
+              <w:ind w:left="0" w:firstLine="0"/>
+              <w:rPr>
+                <w:rFonts w:ascii="Arial Narrow" w:hAnsi="Arial Narrow"/>
+                <w:b/>
+                <w:sz w:val="22"/>
+                <w:szCs w:val="22"/>
+              </w:rPr>
+            </w:pPr>
+          </w:p>
+        </w:tc>
+      </w:tr>
+      <w:tr>
+        <w:tc>
+          <w:tcPr>
+            <w:tcW w:w="1987" w:type="pct"/>
+            <w:tcBorders>
+              <w:top w:val="nil"/>
+              <w:left w:val="nil"/>
+              <w:bottom w:val="single" w:sz="4" w:space="0" w:color="auto"/>
+              <w:right w:val="nil"/>
+            </w:tcBorders>
+          </w:tcPr>
+          <w:p>
+            <w:pPr>
+              <w:tabs>
+                <w:tab w:val="clear" w:pos="1440"/>
+              </w:tabs>
+              <w:ind w:left="0" w:firstLine="0"/>
+              <w:rPr>
+                <w:rFonts w:ascii="Arial Narrow" w:hAnsi="Arial Narrow"/>
+                <w:b/>
+                <w:sz w:val="22"/>
+                <w:szCs w:val="22"/>
+              </w:rPr>
+            </w:pPr>
+          </w:p>
+        </w:tc>
+        <w:tc>
+          <w:tcPr>
+            <w:tcW w:w="1011" w:type="pct"/>
+            <w:tcBorders>
+              <w:top w:val="nil"/>
+              <w:left w:val="nil"/>
+              <w:bottom w:val="nil"/>
+              <w:right w:val="nil"/>
+            </w:tcBorders>
+          </w:tcPr>
+          <w:p>
+            <w:pPr>
+              <w:tabs>
+                <w:tab w:val="clear" w:pos="1440"/>
+              </w:tabs>
+              <w:ind w:left="0" w:firstLine="0"/>
+              <w:rPr>
+                <w:rFonts w:ascii="Arial Narrow" w:hAnsi="Arial Narrow"/>
+                <w:b/>
+                <w:sz w:val="22"/>
+                <w:szCs w:val="22"/>
+              </w:rPr>
+            </w:pPr>
+          </w:p>
+        </w:tc>
+        <w:tc>
+          <w:tcPr>
+            <w:tcW w:w="2002" w:type="pct"/>
+            <w:tcBorders>
+              <w:top w:val="nil"/>
+              <w:left w:val="nil"/>
+              <w:bottom w:val="single" w:sz="4" w:space="0" w:color="auto"/>
+              <w:right w:val="nil"/>
+            </w:tcBorders>
+          </w:tcPr>
+          <w:p>
+            <w:pPr>
+              <w:tabs>
+                <w:tab w:val="clear" w:pos="1440"/>
+              </w:tabs>
+              <w:ind w:left="0" w:firstLine="0"/>
+              <w:rPr>
+                <w:rFonts w:ascii="Arial Narrow" w:hAnsi="Arial Narrow"/>
+                <w:b/>
+                <w:sz w:val="22"/>
+                <w:szCs w:val="22"/>
+              </w:rPr>
+            </w:pPr>
+          </w:p>
+        </w:tc>
+      </w:tr>
+      <w:tr>
+        <w:tc>
+          <w:tcPr>
+            <w:tcW w:w="1987" w:type="pct"/>
+            <w:tcBorders>
+              <w:top w:val="single" w:sz="4" w:space="0" w:color="auto"/>
+              <w:left w:val="nil"/>
+              <w:bottom w:val="nil"/>
+              <w:right w:val="nil"/>
+            </w:tcBorders>
+          </w:tcPr>
+          <w:p>
+            <w:pPr>
+              <w:tabs>
+                <w:tab w:val="clear" w:pos="1440"/>
+              </w:tabs>
+              <w:ind w:left="0" w:firstLine="0"/>
+              <w:jc w:val="center"/>
+              <w:rPr>
+                <w:rFonts w:ascii="Arial Narrow" w:hAnsi="Arial Narrow"/>
+                <w:b/>
+                <w:sz w:val="22"/>
+                <w:szCs w:val="22"/>
+              </w:rPr>
+            </w:pPr>
+            <w:r>
+              <w:rPr>
+                <w:rFonts w:ascii="Arial Narrow" w:hAnsi="Arial Narrow"/>
+                <w:b/>
+                <w:sz w:val="22"/>
+                <w:szCs w:val="22"/>
+              </w:rPr>
+              <w:t>EL SUMINISTRADO</w:t>
+            </w:r>
+          </w:p>
+        </w:tc>
+        <w:tc>
+          <w:tcPr>
+            <w:tcW w:w="1011" w:type="pct"/>
+            <w:tcBorders>
+              <w:top w:val="nil"/>
+              <w:left w:val="nil"/>
+              <w:bottom w:val="nil"/>
+              <w:right w:val="nil"/>
+            </w:tcBorders>
+          </w:tcPr>
+          <w:p>
+            <w:pPr>
+              <w:tabs>
+                <w:tab w:val="clear" w:pos="1440"/>
+              </w:tabs>
+              <w:ind w:left="0" w:firstLine="0"/>
+              <w:jc w:val="center"/>
+              <w:rPr>
+                <w:rFonts w:ascii="Arial Narrow" w:hAnsi="Arial Narrow"/>
+                <w:b/>
+                <w:sz w:val="22"/>
+                <w:szCs w:val="22"/>
+              </w:rPr>
+            </w:pPr>
+          </w:p>
+        </w:tc>
+        <w:tc>
+          <w:tcPr>
+            <w:tcW w:w="2002" w:type="pct"/>
+            <w:tcBorders>
+              <w:top w:val="single" w:sz="4" w:space="0" w:color="auto"/>
+              <w:left w:val="nil"/>
+              <w:bottom w:val="nil"/>
+              <w:right w:val="nil"/>
+            </w:tcBorders>
+          </w:tcPr>
+          <w:p>
+            <w:pPr>
+              <w:tabs>
+                <w:tab w:val="clear" w:pos="1440"/>
+              </w:tabs>
+              <w:ind w:left="0" w:firstLine="0"/>
+              <w:jc w:val="center"/>
+              <w:rPr>
+                <w:rFonts w:ascii="Arial Narrow" w:hAnsi="Arial Narrow"/>
+                <w:b/>
+                <w:sz w:val="22"/>
+                <w:szCs w:val="22"/>
+              </w:rPr>
+            </w:pPr>
+            <w:r>
+              <w:rPr>
+                <w:rFonts w:ascii="Arial Narrow" w:hAnsi="Arial Narrow"/>
+                <w:b/>
+                <w:sz w:val="22"/>
+                <w:szCs w:val="22"/>
+              </w:rPr>
+              <w:t>EL SUMINISTRANTE</w:t>
+            </w:r>
+          </w:p>
+        </w:tc>
+      </w:tr>
+    </w:tbl>
+    <w:p>
+      <w:pPr>
+        <w:ind w:left="0" w:firstLine="0"/>
+        <w:jc w:val="both"/>
+        <w:rPr>
+          <w:rFonts w:ascii="Arial Narrow" w:hAnsi="Arial Narrow"/>
+          <w:sz w:val="22"/>
+          <w:szCs w:val="22"/>
+          <w:lang w:val="es-PE"/>
+        </w:rPr>
+      </w:pPr>
+      <w:r>
+        <w:rPr>
+          <w:rFonts w:ascii="Arial Narrow" w:hAnsi="Arial Narrow"/>
+          <w:sz w:val="22"/>
+          <w:szCs w:val="22"/>
+        </w:rPr>
+        <w:t>En señal de conformidad las pares suscriben el presente documento en la ciudad de Lima, al</w:t>
+      </w:r>
+      <w:r>
+        <w:rPr>
+          <w:rFonts w:ascii="Arial Narrow" w:hAnsi="Arial Narrow"/>
+          <w:sz w:val="22"/>
+          <w:szCs w:val="22"/>
+        </w:rPr>
+        <w:t xml:space="preserve"> </w:t>
+      </w:r>
+      <w:r>
+        <w:rPr>
+          <w:rFonts w:ascii="Arial Narrow" w:hAnsi="Arial Narrow"/>
+          <w:sz w:val="22"/>
+          <w:szCs w:val="22"/>
+          <w:lang w:val="es-PE"/>
+        </w:rPr>
+        <w:t>{{FECHA_FIRMA_DEL_CONTRATO}}</w:t>
+      </w:r>
     </w:p>
     <w:p>
       <w:pPr>
@@ -7869,9 +8711,9 @@
           <w:tab w:val="clear" w:pos="1440"/>
         </w:tabs>
         <w:ind w:left="0" w:firstLine="0"/>
-        <w:jc w:val="both"/>
-        <w:rPr>
-          <w:rFonts w:ascii="Arial Narrow" w:hAnsi="Arial Narrow"/>
+        <w:rPr>
+          <w:rFonts w:ascii="Arial Narrow" w:hAnsi="Arial Narrow"/>
+          <w:b/>
           <w:sz w:val="22"/>
           <w:szCs w:val="22"/>
         </w:rPr>
@@ -7882,186 +8724,6 @@
         <w:tabs>
           <w:tab w:val="clear" w:pos="1440"/>
         </w:tabs>
-        <w:ind w:left="0" w:firstLine="0"/>
-        <w:jc w:val="both"/>
-        <w:rPr>
-          <w:rFonts w:ascii="Arial Narrow" w:hAnsi="Arial Narrow"/>
-          <w:sz w:val="22"/>
-          <w:szCs w:val="22"/>
-        </w:rPr>
-      </w:pPr>
-    </w:p>
-    <w:p>
-      <w:pPr>
-        <w:tabs>
-          <w:tab w:val="clear" w:pos="1440"/>
-        </w:tabs>
-        <w:ind w:left="0" w:firstLine="0"/>
-        <w:jc w:val="both"/>
-        <w:rPr>
-          <w:rFonts w:ascii="Arial Narrow" w:hAnsi="Arial Narrow"/>
-          <w:sz w:val="22"/>
-          <w:szCs w:val="22"/>
-        </w:rPr>
-      </w:pPr>
-    </w:p>
-    <w:p>
-      <w:pPr>
-        <w:tabs>
-          <w:tab w:val="clear" w:pos="1440"/>
-        </w:tabs>
-        <w:ind w:left="0" w:firstLine="0"/>
-        <w:jc w:val="both"/>
-        <w:rPr>
-          <w:rFonts w:ascii="Arial Narrow" w:hAnsi="Arial Narrow"/>
-          <w:sz w:val="22"/>
-          <w:szCs w:val="22"/>
-        </w:rPr>
-      </w:pPr>
-    </w:p>
-    <w:p>
-      <w:pPr>
-        <w:tabs>
-          <w:tab w:val="clear" w:pos="1440"/>
-        </w:tabs>
-        <w:ind w:left="0" w:firstLine="0"/>
-        <w:jc w:val="both"/>
-        <w:rPr>
-          <w:rFonts w:ascii="Arial Narrow" w:hAnsi="Arial Narrow"/>
-          <w:sz w:val="22"/>
-          <w:szCs w:val="22"/>
-        </w:rPr>
-      </w:pPr>
-    </w:p>
-    <w:p>
-      <w:pPr>
-        <w:tabs>
-          <w:tab w:val="clear" w:pos="1440"/>
-        </w:tabs>
-        <w:ind w:left="0" w:firstLine="0"/>
-        <w:jc w:val="both"/>
-        <w:rPr>
-          <w:rFonts w:ascii="Arial Narrow" w:hAnsi="Arial Narrow"/>
-          <w:sz w:val="22"/>
-          <w:szCs w:val="22"/>
-        </w:rPr>
-      </w:pPr>
-    </w:p>
-    <w:p>
-      <w:pPr>
-        <w:tabs>
-          <w:tab w:val="clear" w:pos="1440"/>
-        </w:tabs>
-        <w:ind w:left="0" w:firstLine="0"/>
-        <w:jc w:val="both"/>
-        <w:rPr>
-          <w:rFonts w:ascii="Arial Narrow" w:hAnsi="Arial Narrow"/>
-          <w:sz w:val="22"/>
-          <w:szCs w:val="22"/>
-        </w:rPr>
-      </w:pPr>
-      <w:r>
-        <w:rPr>
-          <w:rFonts w:ascii="Arial Narrow" w:hAnsi="Arial Narrow"/>
-          <w:sz w:val="22"/>
-          <w:szCs w:val="22"/>
-        </w:rPr>
-        <w:tab/>
-        <w:t>______________________________</w:t>
-      </w:r>
-      <w:r>
-        <w:rPr>
-          <w:rFonts w:ascii="Arial Narrow" w:hAnsi="Arial Narrow"/>
-          <w:sz w:val="22"/>
-          <w:szCs w:val="22"/>
-        </w:rPr>
-        <w:tab/>
-      </w:r>
-      <w:r>
-        <w:rPr>
-          <w:rFonts w:ascii="Arial Narrow" w:hAnsi="Arial Narrow"/>
-          <w:sz w:val="22"/>
-          <w:szCs w:val="22"/>
-        </w:rPr>
-        <w:tab/>
-        <w:t>________________________________</w:t>
-      </w:r>
-    </w:p>
-    <w:p>
-      <w:pPr>
-        <w:tabs>
-          <w:tab w:val="clear" w:pos="1440"/>
-        </w:tabs>
-        <w:ind w:firstLine="720"/>
-        <w:jc w:val="both"/>
-        <w:rPr>
-          <w:rFonts w:ascii="Arial Narrow" w:hAnsi="Arial Narrow"/>
-          <w:b/>
-          <w:sz w:val="22"/>
-          <w:szCs w:val="22"/>
-        </w:rPr>
-      </w:pPr>
-      <w:r>
-        <w:rPr>
-          <w:rFonts w:ascii="Arial Narrow" w:hAnsi="Arial Narrow"/>
-          <w:b/>
-          <w:sz w:val="22"/>
-          <w:szCs w:val="22"/>
-        </w:rPr>
-        <w:t>EL SUMINISTRADO</w:t>
-      </w:r>
-      <w:r>
-        <w:rPr>
-          <w:rFonts w:ascii="Arial Narrow" w:hAnsi="Arial Narrow"/>
-          <w:b/>
-          <w:sz w:val="22"/>
-          <w:szCs w:val="22"/>
-        </w:rPr>
-        <w:tab/>
-      </w:r>
-      <w:r>
-        <w:rPr>
-          <w:rFonts w:ascii="Arial Narrow" w:hAnsi="Arial Narrow"/>
-          <w:b/>
-          <w:sz w:val="22"/>
-          <w:szCs w:val="22"/>
-        </w:rPr>
-        <w:tab/>
-      </w:r>
-      <w:r>
-        <w:rPr>
-          <w:rFonts w:ascii="Arial Narrow" w:hAnsi="Arial Narrow"/>
-          <w:b/>
-          <w:sz w:val="22"/>
-          <w:szCs w:val="22"/>
-        </w:rPr>
-        <w:tab/>
-      </w:r>
-      <w:r>
-        <w:rPr>
-          <w:rFonts w:ascii="Arial Narrow" w:hAnsi="Arial Narrow"/>
-          <w:b/>
-          <w:sz w:val="22"/>
-          <w:szCs w:val="22"/>
-        </w:rPr>
-        <w:tab/>
-      </w:r>
-      <w:r>
-        <w:rPr>
-          <w:rFonts w:ascii="Arial Narrow" w:hAnsi="Arial Narrow"/>
-          <w:b/>
-          <w:sz w:val="22"/>
-          <w:szCs w:val="22"/>
-        </w:rPr>
-        <w:t xml:space="preserve">EL SUMINISTRANTE   </w:t>
-      </w:r>
-    </w:p>
-    <w:p>
-      <w:pPr>
-        <w:tabs>
-          <w:tab w:val="clear" w:pos="1440"/>
-        </w:tabs>
-        <w:ind w:firstLine="0"/>
         <w:rPr>
           <w:rFonts w:ascii="Arial Narrow" w:hAnsi="Arial Narrow"/>
           <w:b/>
@@ -10142,168 +10804,6 @@
     </w:p>
     <w:p>
       <w:pPr>
-        <w:tabs>
-          <w:tab w:val="clear" w:pos="1440"/>
-        </w:tabs>
-        <w:autoSpaceDE w:val="0"/>
-        <w:autoSpaceDN w:val="0"/>
-        <w:adjustRightInd w:val="0"/>
-        <w:ind w:left="0" w:firstLine="0"/>
-        <w:jc w:val="both"/>
-        <w:rPr>
-          <w:rFonts w:ascii="Arial Narrow" w:hAnsi="Arial Narrow" w:cs="Calibri"/>
-          <w:sz w:val="22"/>
-          <w:szCs w:val="22"/>
-          <w:lang w:val="es-PE" w:eastAsia="es-PE"/>
-        </w:rPr>
-      </w:pPr>
-    </w:p>
-    <w:p>
-      <w:pPr>
-        <w:tabs>
-          <w:tab w:val="clear" w:pos="1440"/>
-        </w:tabs>
-        <w:autoSpaceDE w:val="0"/>
-        <w:autoSpaceDN w:val="0"/>
-        <w:adjustRightInd w:val="0"/>
-        <w:ind w:left="0" w:firstLine="0"/>
-        <w:jc w:val="both"/>
-        <w:rPr>
-          <w:rFonts w:ascii="Arial Narrow" w:hAnsi="Arial Narrow" w:cs="Calibri"/>
-          <w:sz w:val="22"/>
-          <w:szCs w:val="22"/>
-          <w:lang w:val="es-PE" w:eastAsia="es-PE"/>
-        </w:rPr>
-      </w:pPr>
-    </w:p>
-    <w:p>
-      <w:pPr>
-        <w:tabs>
-          <w:tab w:val="clear" w:pos="1440"/>
-        </w:tabs>
-        <w:autoSpaceDE w:val="0"/>
-        <w:autoSpaceDN w:val="0"/>
-        <w:adjustRightInd w:val="0"/>
-        <w:ind w:left="0" w:firstLine="0"/>
-        <w:jc w:val="both"/>
-        <w:rPr>
-          <w:rFonts w:ascii="Arial Narrow" w:hAnsi="Arial Narrow" w:cs="Calibri"/>
-          <w:sz w:val="22"/>
-          <w:szCs w:val="22"/>
-          <w:lang w:val="es-PE" w:eastAsia="es-PE"/>
-        </w:rPr>
-      </w:pPr>
-    </w:p>
-    <w:p>
-      <w:pPr>
-        <w:tabs>
-          <w:tab w:val="clear" w:pos="1440"/>
-        </w:tabs>
-        <w:autoSpaceDE w:val="0"/>
-        <w:autoSpaceDN w:val="0"/>
-        <w:adjustRightInd w:val="0"/>
-        <w:ind w:left="0" w:firstLine="0"/>
-        <w:jc w:val="both"/>
-        <w:rPr>
-          <w:rFonts w:ascii="Arial Narrow" w:hAnsi="Arial Narrow" w:cs="Calibri"/>
-          <w:sz w:val="22"/>
-          <w:szCs w:val="22"/>
-          <w:lang w:val="es-PE" w:eastAsia="es-PE"/>
-        </w:rPr>
-      </w:pPr>
-    </w:p>
-    <w:p>
-      <w:pPr>
-        <w:tabs>
-          <w:tab w:val="clear" w:pos="1440"/>
-        </w:tabs>
-        <w:autoSpaceDE w:val="0"/>
-        <w:autoSpaceDN w:val="0"/>
-        <w:adjustRightInd w:val="0"/>
-        <w:ind w:left="0" w:firstLine="0"/>
-        <w:jc w:val="both"/>
-        <w:rPr>
-          <w:rFonts w:ascii="Arial Narrow" w:hAnsi="Arial Narrow" w:cs="Calibri"/>
-          <w:sz w:val="22"/>
-          <w:szCs w:val="22"/>
-          <w:lang w:val="es-PE" w:eastAsia="es-PE"/>
-        </w:rPr>
-      </w:pPr>
-    </w:p>
-    <w:p>
-      <w:pPr>
-        <w:tabs>
-          <w:tab w:val="clear" w:pos="1440"/>
-        </w:tabs>
-        <w:autoSpaceDE w:val="0"/>
-        <w:autoSpaceDN w:val="0"/>
-        <w:adjustRightInd w:val="0"/>
-        <w:ind w:left="0" w:firstLine="0"/>
-        <w:jc w:val="both"/>
-        <w:rPr>
-          <w:rFonts w:ascii="Arial Narrow" w:hAnsi="Arial Narrow" w:cs="Calibri"/>
-          <w:sz w:val="22"/>
-          <w:szCs w:val="22"/>
-          <w:lang w:val="es-PE" w:eastAsia="es-PE"/>
-        </w:rPr>
-      </w:pPr>
-    </w:p>
-    <w:p>
-      <w:pPr>
-        <w:tabs>
-          <w:tab w:val="clear" w:pos="1440"/>
-        </w:tabs>
-        <w:autoSpaceDE w:val="0"/>
-        <w:autoSpaceDN w:val="0"/>
-        <w:adjustRightInd w:val="0"/>
-        <w:ind w:left="0" w:firstLine="0"/>
-        <w:jc w:val="both"/>
-        <w:rPr>
-          <w:rFonts w:ascii="Arial Narrow" w:hAnsi="Arial Narrow" w:cs="Calibri"/>
-          <w:sz w:val="22"/>
-          <w:szCs w:val="22"/>
-          <w:lang w:val="es-PE" w:eastAsia="es-PE"/>
-        </w:rPr>
-      </w:pPr>
-    </w:p>
-    <w:p>
-      <w:pPr>
-        <w:tabs>
-          <w:tab w:val="clear" w:pos="1440"/>
-        </w:tabs>
-        <w:autoSpaceDE w:val="0"/>
-        <w:autoSpaceDN w:val="0"/>
-        <w:adjustRightInd w:val="0"/>
-        <w:ind w:left="0" w:firstLine="0"/>
-        <w:jc w:val="both"/>
-        <w:rPr>
-          <w:rFonts w:ascii="Arial Narrow" w:hAnsi="Arial Narrow" w:cs="Calibri"/>
-          <w:sz w:val="22"/>
-          <w:szCs w:val="22"/>
-          <w:lang w:val="es-PE" w:eastAsia="es-PE"/>
-        </w:rPr>
-      </w:pPr>
-    </w:p>
-    <w:p>
-      <w:pPr>
-        <w:tabs>
-          <w:tab w:val="clear" w:pos="1440"/>
-        </w:tabs>
-        <w:autoSpaceDE w:val="0"/>
-        <w:autoSpaceDN w:val="0"/>
-        <w:adjustRightInd w:val="0"/>
-        <w:ind w:left="0" w:firstLine="0"/>
-        <w:jc w:val="both"/>
-        <w:rPr>
-          <w:rFonts w:ascii="Arial Narrow" w:hAnsi="Arial Narrow" w:cs="Calibri"/>
-          <w:sz w:val="22"/>
-          <w:szCs w:val="22"/>
-          <w:lang w:val="es-PE" w:eastAsia="es-PE"/>
-        </w:rPr>
-      </w:pPr>
-    </w:p>
-    <w:p>
-      <w:pPr>
         <w:pStyle w:val="Prrafodelista"/>
         <w:numPr>
           <w:ilvl w:val="0"/>
@@ -10483,7 +10983,6 @@
           <w:szCs w:val="22"/>
           <w:lang w:val="es-PE" w:eastAsia="es-PE"/>
         </w:rPr>
-        <w:lastRenderedPageBreak/>
         <w:t xml:space="preserve">b. El uso de los </w:t>
       </w:r>
       <w:r>

</xml_diff>

<commit_message>
add cambio en plantilla de suministro
</commit_message>
<xml_diff>
--- a/Features/CostsModule/Features/AdjudicacionesFeature/Templates/plantilla_suministro_con_placeholders.docx
+++ b/Features/CostsModule/Features/AdjudicacionesFeature/Templates/plantilla_suministro_con_placeholders.docx
@@ -1444,7 +1444,25 @@
           <w:sz w:val="22"/>
           <w:szCs w:val="22"/>
         </w:rPr>
-        <w:t xml:space="preserve"> {{CONTRATISTA_PARTIDA_REGISTRAL}} del Registro de Personas Jurídicas de la Oficina Registral de Lima</w:t>
+        <w:t xml:space="preserve"> {{CONTRATISTA_PARTIDA_REGISTRAL}</w:t>
+      </w:r>
+      <w:r>
+        <w:rPr>
+          <w:rFonts w:ascii="Arial Narrow" w:hAnsi="Arial Narrow"/>
+          <w:bCs/>
+          <w:sz w:val="22"/>
+          <w:szCs w:val="22"/>
+        </w:rPr>
+        <w:t>}</w:t>
+      </w:r>
+      <w:r>
+        <w:rPr>
+          <w:rFonts w:ascii="Arial Narrow" w:hAnsi="Arial Narrow"/>
+          <w:bCs/>
+          <w:sz w:val="22"/>
+          <w:szCs w:val="22"/>
+        </w:rPr>
+        <w:t xml:space="preserve"> del Registro de Personas Jurídicas de la Oficina Registral de Lima</w:t>
       </w:r>
       <w:r>
         <w:rPr>

</xml_diff>